<commit_message>
cuaderno Jupyter de apoyo a los estudiantes
</commit_message>
<xml_diff>
--- a/3_paciales/1_parcial/Parcial1_Programacion_Python_v3.docx
+++ b/3_paciales/1_parcial/Parcial1_Programacion_Python_v3.docx
@@ -689,11 +689,19 @@
             <w:tcW w:w="3600" w:type="dxa"/>
           </w:tcPr>
           <w:p>
-            <w:r>
-              <w:rPr>
-                <w:rFonts w:ascii="Calibri" w:eastAsia="Calibri" w:hAnsi="Calibri" w:cs="Calibri"/>
-              </w:rPr>
-              <w:t>Mini-proyecto: diseño de un programa desde cero</w:t>
+            <w:proofErr w:type="spellStart"/>
+            <w:r>
+              <w:rPr>
+                <w:rFonts w:ascii="Calibri" w:eastAsia="Calibri" w:hAnsi="Calibri" w:cs="Calibri"/>
+              </w:rPr>
+              <w:t>Mini-proyecto</w:t>
+            </w:r>
+            <w:proofErr w:type="spellEnd"/>
+            <w:r>
+              <w:rPr>
+                <w:rFonts w:ascii="Calibri" w:eastAsia="Calibri" w:hAnsi="Calibri" w:cs="Calibri"/>
+              </w:rPr>
+              <w:t>: diseño de un programa desde cero</w:t>
             </w:r>
           </w:p>
         </w:tc>
@@ -1070,7 +1078,27 @@
           <w:szCs w:val="22"/>
           <w:lang w:val="en-US"/>
         </w:rPr>
-        <w:t>a) list      b) dict      c) tuple      d) set</w:t>
+        <w:t xml:space="preserve">a) list      b) </w:t>
+      </w:r>
+      <w:proofErr w:type="spellStart"/>
+      <w:r>
+        <w:rPr>
+          <w:rFonts w:ascii="Calibri" w:eastAsia="Calibri" w:hAnsi="Calibri" w:cs="Calibri"/>
+          <w:sz w:val="22"/>
+          <w:szCs w:val="22"/>
+          <w:lang w:val="en-US"/>
+        </w:rPr>
+        <w:t>dict</w:t>
+      </w:r>
+      <w:proofErr w:type="spellEnd"/>
+      <w:r>
+        <w:rPr>
+          <w:rFonts w:ascii="Calibri" w:eastAsia="Calibri" w:hAnsi="Calibri" w:cs="Calibri"/>
+          <w:sz w:val="22"/>
+          <w:szCs w:val="22"/>
+          <w:lang w:val="en-US"/>
+        </w:rPr>
+        <w:t xml:space="preserve">      c) tuple      d) set</w:t>
       </w:r>
     </w:p>
     <w:p>
@@ -1136,7 +1164,25 @@
           <w:sz w:val="22"/>
           <w:szCs w:val="22"/>
         </w:rPr>
-        <w:t>a) ==      b) is      c) in      d) !=</w:t>
+        <w:t xml:space="preserve">a) ==      b) </w:t>
+      </w:r>
+      <w:proofErr w:type="spellStart"/>
+      <w:r>
+        <w:rPr>
+          <w:rFonts w:ascii="Calibri" w:eastAsia="Calibri" w:hAnsi="Calibri" w:cs="Calibri"/>
+          <w:sz w:val="22"/>
+          <w:szCs w:val="22"/>
+        </w:rPr>
+        <w:t>is</w:t>
+      </w:r>
+      <w:proofErr w:type="spellEnd"/>
+      <w:r>
+        <w:rPr>
+          <w:rFonts w:ascii="Calibri" w:eastAsia="Calibri" w:hAnsi="Calibri" w:cs="Calibri"/>
+          <w:sz w:val="22"/>
+          <w:szCs w:val="22"/>
+        </w:rPr>
+        <w:t xml:space="preserve">      c) in      d) !=</w:t>
       </w:r>
     </w:p>
     <w:p>
@@ -1151,7 +1197,95 @@
           <w:sz w:val="22"/>
           <w:szCs w:val="22"/>
         </w:rPr>
-        <w:t>5. Dada la precedencia not &gt; and &gt; or, ¿cuál expresión se evalúa primero en True or False and not True?</w:t>
+        <w:t xml:space="preserve">5. Dada la precedencia </w:t>
+      </w:r>
+      <w:proofErr w:type="spellStart"/>
+      <w:r>
+        <w:rPr>
+          <w:rFonts w:ascii="Calibri" w:eastAsia="Calibri" w:hAnsi="Calibri" w:cs="Calibri"/>
+          <w:b/>
+          <w:bCs/>
+          <w:sz w:val="22"/>
+          <w:szCs w:val="22"/>
+        </w:rPr>
+        <w:t>not</w:t>
+      </w:r>
+      <w:proofErr w:type="spellEnd"/>
+      <w:r>
+        <w:rPr>
+          <w:rFonts w:ascii="Calibri" w:eastAsia="Calibri" w:hAnsi="Calibri" w:cs="Calibri"/>
+          <w:b/>
+          <w:bCs/>
+          <w:sz w:val="22"/>
+          <w:szCs w:val="22"/>
+        </w:rPr>
+        <w:t xml:space="preserve"> &gt; and &gt; </w:t>
+      </w:r>
+      <w:proofErr w:type="spellStart"/>
+      <w:r>
+        <w:rPr>
+          <w:rFonts w:ascii="Calibri" w:eastAsia="Calibri" w:hAnsi="Calibri" w:cs="Calibri"/>
+          <w:b/>
+          <w:bCs/>
+          <w:sz w:val="22"/>
+          <w:szCs w:val="22"/>
+        </w:rPr>
+        <w:t>or</w:t>
+      </w:r>
+      <w:proofErr w:type="spellEnd"/>
+      <w:r>
+        <w:rPr>
+          <w:rFonts w:ascii="Calibri" w:eastAsia="Calibri" w:hAnsi="Calibri" w:cs="Calibri"/>
+          <w:b/>
+          <w:bCs/>
+          <w:sz w:val="22"/>
+          <w:szCs w:val="22"/>
+        </w:rPr>
+        <w:t xml:space="preserve">, ¿cuál expresión se evalúa primero en True </w:t>
+      </w:r>
+      <w:proofErr w:type="spellStart"/>
+      <w:r>
+        <w:rPr>
+          <w:rFonts w:ascii="Calibri" w:eastAsia="Calibri" w:hAnsi="Calibri" w:cs="Calibri"/>
+          <w:b/>
+          <w:bCs/>
+          <w:sz w:val="22"/>
+          <w:szCs w:val="22"/>
+        </w:rPr>
+        <w:t>or</w:t>
+      </w:r>
+      <w:proofErr w:type="spellEnd"/>
+      <w:r>
+        <w:rPr>
+          <w:rFonts w:ascii="Calibri" w:eastAsia="Calibri" w:hAnsi="Calibri" w:cs="Calibri"/>
+          <w:b/>
+          <w:bCs/>
+          <w:sz w:val="22"/>
+          <w:szCs w:val="22"/>
+        </w:rPr>
+        <w:t xml:space="preserve"> False and </w:t>
+      </w:r>
+      <w:proofErr w:type="spellStart"/>
+      <w:r>
+        <w:rPr>
+          <w:rFonts w:ascii="Calibri" w:eastAsia="Calibri" w:hAnsi="Calibri" w:cs="Calibri"/>
+          <w:b/>
+          <w:bCs/>
+          <w:sz w:val="22"/>
+          <w:szCs w:val="22"/>
+        </w:rPr>
+        <w:t>not</w:t>
+      </w:r>
+      <w:proofErr w:type="spellEnd"/>
+      <w:r>
+        <w:rPr>
+          <w:rFonts w:ascii="Calibri" w:eastAsia="Calibri" w:hAnsi="Calibri" w:cs="Calibri"/>
+          <w:b/>
+          <w:bCs/>
+          <w:sz w:val="22"/>
+          <w:szCs w:val="22"/>
+        </w:rPr>
+        <w:t xml:space="preserve"> True?</w:t>
       </w:r>
     </w:p>
     <w:p>
@@ -1173,8 +1307,39 @@
           <w:szCs w:val="22"/>
           <w:lang w:val="en-US"/>
         </w:rPr>
-        <w:t>a) True or False      b) not True      c) False and not True      d) Todo se evalúa simultáneamente</w:t>
-      </w:r>
+        <w:t xml:space="preserve">a) True or False      b) not True      c) False and not True      d) Todo se </w:t>
+      </w:r>
+      <w:proofErr w:type="spellStart"/>
+      <w:r>
+        <w:rPr>
+          <w:rFonts w:ascii="Calibri" w:eastAsia="Calibri" w:hAnsi="Calibri" w:cs="Calibri"/>
+          <w:sz w:val="22"/>
+          <w:szCs w:val="22"/>
+          <w:lang w:val="en-US"/>
+        </w:rPr>
+        <w:t>evalúa</w:t>
+      </w:r>
+      <w:proofErr w:type="spellEnd"/>
+      <w:r>
+        <w:rPr>
+          <w:rFonts w:ascii="Calibri" w:eastAsia="Calibri" w:hAnsi="Calibri" w:cs="Calibri"/>
+          <w:sz w:val="22"/>
+          <w:szCs w:val="22"/>
+          <w:lang w:val="en-US"/>
+        </w:rPr>
+        <w:t xml:space="preserve"> </w:t>
+      </w:r>
+      <w:proofErr w:type="spellStart"/>
+      <w:r>
+        <w:rPr>
+          <w:rFonts w:ascii="Calibri" w:eastAsia="Calibri" w:hAnsi="Calibri" w:cs="Calibri"/>
+          <w:sz w:val="22"/>
+          <w:szCs w:val="22"/>
+          <w:lang w:val="en-US"/>
+        </w:rPr>
+        <w:t>simultáneamente</w:t>
+      </w:r>
+      <w:proofErr w:type="spellEnd"/>
     </w:p>
     <w:p>
       <w:pPr>
@@ -1272,7 +1437,43 @@
           <w:sz w:val="22"/>
           <w:szCs w:val="22"/>
         </w:rPr>
-        <w:t>a) list      b) tuple      c) set      d) Todas las anteriores permiten duplicados</w:t>
+        <w:t xml:space="preserve">a) </w:t>
+      </w:r>
+      <w:proofErr w:type="spellStart"/>
+      <w:r>
+        <w:rPr>
+          <w:rFonts w:ascii="Calibri" w:eastAsia="Calibri" w:hAnsi="Calibri" w:cs="Calibri"/>
+          <w:sz w:val="22"/>
+          <w:szCs w:val="22"/>
+        </w:rPr>
+        <w:t>list</w:t>
+      </w:r>
+      <w:proofErr w:type="spellEnd"/>
+      <w:r>
+        <w:rPr>
+          <w:rFonts w:ascii="Calibri" w:eastAsia="Calibri" w:hAnsi="Calibri" w:cs="Calibri"/>
+          <w:sz w:val="22"/>
+          <w:szCs w:val="22"/>
+        </w:rPr>
+        <w:t xml:space="preserve">      b) </w:t>
+      </w:r>
+      <w:proofErr w:type="spellStart"/>
+      <w:r>
+        <w:rPr>
+          <w:rFonts w:ascii="Calibri" w:eastAsia="Calibri" w:hAnsi="Calibri" w:cs="Calibri"/>
+          <w:sz w:val="22"/>
+          <w:szCs w:val="22"/>
+        </w:rPr>
+        <w:t>tuple</w:t>
+      </w:r>
+      <w:proofErr w:type="spellEnd"/>
+      <w:r>
+        <w:rPr>
+          <w:rFonts w:ascii="Calibri" w:eastAsia="Calibri" w:hAnsi="Calibri" w:cs="Calibri"/>
+          <w:sz w:val="22"/>
+          <w:szCs w:val="22"/>
+        </w:rPr>
+        <w:t xml:space="preserve">      c) set      d) Todas las anteriores permiten duplicados</w:t>
       </w:r>
     </w:p>
     <w:p>
@@ -1305,7 +1506,61 @@
           <w:sz w:val="22"/>
           <w:szCs w:val="22"/>
         </w:rPr>
-        <w:t>a) a == b es True y a is b es True      b) a == b es True y a is b es False      c) a == b es False y a is b es True      d) Ambas son False</w:t>
+        <w:t xml:space="preserve">a) a == b es True y a </w:t>
+      </w:r>
+      <w:proofErr w:type="spellStart"/>
+      <w:r>
+        <w:rPr>
+          <w:rFonts w:ascii="Calibri" w:eastAsia="Calibri" w:hAnsi="Calibri" w:cs="Calibri"/>
+          <w:sz w:val="22"/>
+          <w:szCs w:val="22"/>
+        </w:rPr>
+        <w:t>is</w:t>
+      </w:r>
+      <w:proofErr w:type="spellEnd"/>
+      <w:r>
+        <w:rPr>
+          <w:rFonts w:ascii="Calibri" w:eastAsia="Calibri" w:hAnsi="Calibri" w:cs="Calibri"/>
+          <w:sz w:val="22"/>
+          <w:szCs w:val="22"/>
+        </w:rPr>
+        <w:t xml:space="preserve"> b es True      b) a == b es True y a </w:t>
+      </w:r>
+      <w:proofErr w:type="spellStart"/>
+      <w:r>
+        <w:rPr>
+          <w:rFonts w:ascii="Calibri" w:eastAsia="Calibri" w:hAnsi="Calibri" w:cs="Calibri"/>
+          <w:sz w:val="22"/>
+          <w:szCs w:val="22"/>
+        </w:rPr>
+        <w:t>is</w:t>
+      </w:r>
+      <w:proofErr w:type="spellEnd"/>
+      <w:r>
+        <w:rPr>
+          <w:rFonts w:ascii="Calibri" w:eastAsia="Calibri" w:hAnsi="Calibri" w:cs="Calibri"/>
+          <w:sz w:val="22"/>
+          <w:szCs w:val="22"/>
+        </w:rPr>
+        <w:t xml:space="preserve"> b es False      c) a == b es False y a </w:t>
+      </w:r>
+      <w:proofErr w:type="spellStart"/>
+      <w:r>
+        <w:rPr>
+          <w:rFonts w:ascii="Calibri" w:eastAsia="Calibri" w:hAnsi="Calibri" w:cs="Calibri"/>
+          <w:sz w:val="22"/>
+          <w:szCs w:val="22"/>
+        </w:rPr>
+        <w:t>is</w:t>
+      </w:r>
+      <w:proofErr w:type="spellEnd"/>
+      <w:r>
+        <w:rPr>
+          <w:rFonts w:ascii="Calibri" w:eastAsia="Calibri" w:hAnsi="Calibri" w:cs="Calibri"/>
+          <w:sz w:val="22"/>
+          <w:szCs w:val="22"/>
+        </w:rPr>
+        <w:t xml:space="preserve"> b es True      d) Ambas son False</w:t>
       </w:r>
     </w:p>
     <w:p>
@@ -1320,7 +1575,29 @@
           <w:sz w:val="22"/>
           <w:szCs w:val="22"/>
         </w:rPr>
-        <w:t>10. ¿Cuál es el resultado de bool(0) en Python?</w:t>
+        <w:t xml:space="preserve">10. ¿Cuál es el resultado de </w:t>
+      </w:r>
+      <w:proofErr w:type="spellStart"/>
+      <w:r>
+        <w:rPr>
+          <w:rFonts w:ascii="Calibri" w:eastAsia="Calibri" w:hAnsi="Calibri" w:cs="Calibri"/>
+          <w:b/>
+          <w:bCs/>
+          <w:sz w:val="22"/>
+          <w:szCs w:val="22"/>
+        </w:rPr>
+        <w:t>bool</w:t>
+      </w:r>
+      <w:proofErr w:type="spellEnd"/>
+      <w:r>
+        <w:rPr>
+          <w:rFonts w:ascii="Calibri" w:eastAsia="Calibri" w:hAnsi="Calibri" w:cs="Calibri"/>
+          <w:b/>
+          <w:bCs/>
+          <w:sz w:val="22"/>
+          <w:szCs w:val="22"/>
+        </w:rPr>
+        <w:t>(0) en Python?</w:t>
       </w:r>
     </w:p>
     <w:p>
@@ -1458,25 +1735,21 @@
         </w:rPr>
         <w:br/>
       </w:r>
+      <w:proofErr w:type="spellStart"/>
       <w:r>
         <w:rPr>
           <w:rFonts w:ascii="Consolas" w:eastAsia="Consolas" w:hAnsi="Consolas" w:cs="Consolas"/>
           <w:lang w:val="en-US"/>
         </w:rPr>
-        <w:t>a = a + 3</w:t>
-      </w:r>
-      <w:r>
-        <w:rPr>
-          <w:lang w:val="en-US"/>
-        </w:rPr>
-        <w:br/>
-      </w:r>
+        <w:t>a</w:t>
+      </w:r>
+      <w:proofErr w:type="spellEnd"/>
       <w:r>
         <w:rPr>
           <w:rFonts w:ascii="Consolas" w:eastAsia="Consolas" w:hAnsi="Consolas" w:cs="Consolas"/>
           <w:lang w:val="en-US"/>
         </w:rPr>
-        <w:t>c = [1, 2]</w:t>
+        <w:t xml:space="preserve"> = a + 3</w:t>
       </w:r>
       <w:r>
         <w:rPr>
@@ -1489,7 +1762,7 @@
           <w:rFonts w:ascii="Consolas" w:eastAsia="Consolas" w:hAnsi="Consolas" w:cs="Consolas"/>
           <w:lang w:val="en-US"/>
         </w:rPr>
-        <w:t>d = c</w:t>
+        <w:t>c = [1, 2]</w:t>
       </w:r>
       <w:r>
         <w:rPr>
@@ -1502,7 +1775,29 @@
           <w:rFonts w:ascii="Consolas" w:eastAsia="Consolas" w:hAnsi="Consolas" w:cs="Consolas"/>
           <w:lang w:val="en-US"/>
         </w:rPr>
-        <w:t>c.append(3)</w:t>
+        <w:t>d = c</w:t>
+      </w:r>
+      <w:r>
+        <w:rPr>
+          <w:lang w:val="en-US"/>
+        </w:rPr>
+        <w:br/>
+      </w:r>
+      <w:proofErr w:type="spellStart"/>
+      <w:r>
+        <w:rPr>
+          <w:rFonts w:ascii="Consolas" w:eastAsia="Consolas" w:hAnsi="Consolas" w:cs="Consolas"/>
+          <w:lang w:val="en-US"/>
+        </w:rPr>
+        <w:t>c.append</w:t>
+      </w:r>
+      <w:proofErr w:type="spellEnd"/>
+      <w:r>
+        <w:rPr>
+          <w:rFonts w:ascii="Consolas" w:eastAsia="Consolas" w:hAnsi="Consolas" w:cs="Consolas"/>
+          <w:lang w:val="en-US"/>
+        </w:rPr>
+        <w:t>(3)</w:t>
       </w:r>
       <w:r>
         <w:rPr>
@@ -2752,11 +3047,19 @@
       <w:r>
         <w:br/>
       </w:r>
+      <w:proofErr w:type="spellStart"/>
       <w:r>
         <w:rPr>
           <w:rFonts w:ascii="Consolas" w:eastAsia="Consolas" w:hAnsi="Consolas" w:cs="Consolas"/>
         </w:rPr>
-        <w:t>y *= 2</w:t>
+        <w:t>y</w:t>
+      </w:r>
+      <w:proofErr w:type="spellEnd"/>
+      <w:r>
+        <w:rPr>
+          <w:rFonts w:ascii="Consolas" w:eastAsia="Consolas" w:hAnsi="Consolas" w:cs="Consolas"/>
+        </w:rPr>
+        <w:t xml:space="preserve"> *= 2</w:t>
       </w:r>
       <w:r>
         <w:br/>
@@ -2770,11 +3073,19 @@
       <w:r>
         <w:br/>
       </w:r>
+      <w:proofErr w:type="spellStart"/>
       <w:r>
         <w:rPr>
           <w:rFonts w:ascii="Consolas" w:eastAsia="Consolas" w:hAnsi="Consolas" w:cs="Consolas"/>
         </w:rPr>
-        <w:t>cond = x &gt; y and y &gt; 0</w:t>
+        <w:t>cond</w:t>
+      </w:r>
+      <w:proofErr w:type="spellEnd"/>
+      <w:r>
+        <w:rPr>
+          <w:rFonts w:ascii="Consolas" w:eastAsia="Consolas" w:hAnsi="Consolas" w:cs="Consolas"/>
+        </w:rPr>
+        <w:t xml:space="preserve"> = x &gt; y and y &gt; 0</w:t>
       </w:r>
     </w:p>
     <w:tbl>
@@ -2867,6 +3178,7 @@
             <w:shd w:val="clear" w:color="auto" w:fill="3B6E9E"/>
           </w:tcPr>
           <w:p>
+            <w:proofErr w:type="spellStart"/>
             <w:r>
               <w:rPr>
                 <w:rFonts w:ascii="Calibri" w:eastAsia="Calibri" w:hAnsi="Calibri" w:cs="Calibri"/>
@@ -2876,6 +3188,7 @@
               </w:rPr>
               <w:t>cond</w:t>
             </w:r>
+            <w:proofErr w:type="spellEnd"/>
           </w:p>
         </w:tc>
       </w:tr>
@@ -3360,20 +3673,50 @@
       <w:r>
         <w:br/>
       </w:r>
+      <w:proofErr w:type="spellStart"/>
       <w:r>
         <w:rPr>
           <w:rFonts w:ascii="Consolas" w:eastAsia="Consolas" w:hAnsi="Consolas" w:cs="Consolas"/>
         </w:rPr>
-        <w:t>numeros = [4, -2, 7, 0, -5]</w:t>
+        <w:t>numeros</w:t>
+      </w:r>
+      <w:proofErr w:type="spellEnd"/>
+      <w:r>
+        <w:rPr>
+          <w:rFonts w:ascii="Consolas" w:eastAsia="Consolas" w:hAnsi="Consolas" w:cs="Consolas"/>
+        </w:rPr>
+        <w:t xml:space="preserve"> = [4, -2, 7, 0, -5]</w:t>
       </w:r>
       <w:r>
         <w:br/>
       </w:r>
+      <w:proofErr w:type="spellStart"/>
       <w:r>
         <w:rPr>
           <w:rFonts w:ascii="Consolas" w:eastAsia="Consolas" w:hAnsi="Consolas" w:cs="Consolas"/>
         </w:rPr>
-        <w:t>for n in numeros:</w:t>
+        <w:t>for</w:t>
+      </w:r>
+      <w:proofErr w:type="spellEnd"/>
+      <w:r>
+        <w:rPr>
+          <w:rFonts w:ascii="Consolas" w:eastAsia="Consolas" w:hAnsi="Consolas" w:cs="Consolas"/>
+        </w:rPr>
+        <w:t xml:space="preserve"> n in </w:t>
+      </w:r>
+      <w:proofErr w:type="spellStart"/>
+      <w:r>
+        <w:rPr>
+          <w:rFonts w:ascii="Consolas" w:eastAsia="Consolas" w:hAnsi="Consolas" w:cs="Consolas"/>
+        </w:rPr>
+        <w:t>numeros</w:t>
+      </w:r>
+      <w:proofErr w:type="spellEnd"/>
+      <w:r>
+        <w:rPr>
+          <w:rFonts w:ascii="Consolas" w:eastAsia="Consolas" w:hAnsi="Consolas" w:cs="Consolas"/>
+        </w:rPr>
+        <w:t>:</w:t>
       </w:r>
       <w:r>
         <w:br/>
@@ -3382,7 +3725,21 @@
         <w:rPr>
           <w:rFonts w:ascii="Consolas" w:eastAsia="Consolas" w:hAnsi="Consolas" w:cs="Consolas"/>
         </w:rPr>
-        <w:t xml:space="preserve">    if n &gt; 0:</w:t>
+        <w:t xml:space="preserve">    </w:t>
+      </w:r>
+      <w:proofErr w:type="spellStart"/>
+      <w:r>
+        <w:rPr>
+          <w:rFonts w:ascii="Consolas" w:eastAsia="Consolas" w:hAnsi="Consolas" w:cs="Consolas"/>
+        </w:rPr>
+        <w:t>if</w:t>
+      </w:r>
+      <w:proofErr w:type="spellEnd"/>
+      <w:r>
+        <w:rPr>
+          <w:rFonts w:ascii="Consolas" w:eastAsia="Consolas" w:hAnsi="Consolas" w:cs="Consolas"/>
+        </w:rPr>
+        <w:t xml:space="preserve"> n &gt; 0:</w:t>
       </w:r>
       <w:r>
         <w:br/>
@@ -3396,21 +3753,45 @@
       <w:r>
         <w:br/>
       </w:r>
+      <w:proofErr w:type="spellStart"/>
       <w:r>
         <w:rPr>
           <w:rFonts w:ascii="Consolas" w:eastAsia="Consolas" w:hAnsi="Consolas" w:cs="Consolas"/>
         </w:rPr>
-        <w:t>es_positivo = total &gt; 0</w:t>
+        <w:t>es_positivo</w:t>
+      </w:r>
+      <w:proofErr w:type="spellEnd"/>
+      <w:r>
+        <w:rPr>
+          <w:rFonts w:ascii="Consolas" w:eastAsia="Consolas" w:hAnsi="Consolas" w:cs="Consolas"/>
+        </w:rPr>
+        <w:t xml:space="preserve"> = total &gt; 0</w:t>
       </w:r>
       <w:r>
         <w:br/>
       </w:r>
+      <w:proofErr w:type="spellStart"/>
       <w:r>
         <w:rPr>
           <w:rFonts w:ascii="Consolas" w:eastAsia="Consolas" w:hAnsi="Consolas" w:cs="Consolas"/>
         </w:rPr>
-        <w:t>en_lista = -2 in numeros</w:t>
-      </w:r>
+        <w:t>en_lista</w:t>
+      </w:r>
+      <w:proofErr w:type="spellEnd"/>
+      <w:r>
+        <w:rPr>
+          <w:rFonts w:ascii="Consolas" w:eastAsia="Consolas" w:hAnsi="Consolas" w:cs="Consolas"/>
+        </w:rPr>
+        <w:t xml:space="preserve"> = -2 in </w:t>
+      </w:r>
+      <w:proofErr w:type="spellStart"/>
+      <w:r>
+        <w:rPr>
+          <w:rFonts w:ascii="Consolas" w:eastAsia="Consolas" w:hAnsi="Consolas" w:cs="Consolas"/>
+        </w:rPr>
+        <w:t>numeros</w:t>
+      </w:r>
+      <w:proofErr w:type="spellEnd"/>
     </w:p>
     <w:tbl>
       <w:tblPr>
@@ -3503,6 +3884,7 @@
             <w:shd w:val="clear" w:color="auto" w:fill="3B6E9E"/>
           </w:tcPr>
           <w:p>
+            <w:proofErr w:type="spellStart"/>
             <w:r>
               <w:rPr>
                 <w:rFonts w:ascii="Calibri" w:eastAsia="Calibri" w:hAnsi="Calibri" w:cs="Calibri"/>
@@ -3512,6 +3894,7 @@
               </w:rPr>
               <w:t>es_positivo</w:t>
             </w:r>
+            <w:proofErr w:type="spellEnd"/>
           </w:p>
         </w:tc>
         <w:tc>
@@ -3520,6 +3903,7 @@
             <w:shd w:val="clear" w:color="auto" w:fill="3B6E9E"/>
           </w:tcPr>
           <w:p>
+            <w:proofErr w:type="spellStart"/>
             <w:r>
               <w:rPr>
                 <w:rFonts w:ascii="Calibri" w:eastAsia="Calibri" w:hAnsi="Calibri" w:cs="Calibri"/>
@@ -3529,6 +3913,7 @@
               </w:rPr>
               <w:t>en_lista</w:t>
             </w:r>
+            <w:proofErr w:type="spellEnd"/>
           </w:p>
         </w:tc>
       </w:tr>
@@ -4211,13 +4596,9 @@
           <w:sz w:val="22"/>
           <w:szCs w:val="22"/>
         </w:rPr>
-        <w:t>11. (7 puntos) Compare list y tuple respondiendo explícitamente: ¿en qué se diferencian en mutabilidad?, ¿cuál de las dos puede usarse como llave de un diccionario y por qué?, y dé un ejemplo de una situación (distinta a las vistas en clase) donde convenga más una tupla que una lista.</w:t>
-      </w:r>
-    </w:p>
-    <w:p>
-      <w:pPr>
-        <w:spacing w:after="120"/>
-      </w:pPr>
+        <w:t xml:space="preserve">11. (7 puntos) Compare </w:t>
+      </w:r>
+      <w:proofErr w:type="spellStart"/>
       <w:r>
         <w:rPr>
           <w:rFonts w:ascii="Calibri" w:eastAsia="Calibri" w:hAnsi="Calibri" w:cs="Calibri"/>
@@ -4226,7 +4607,99 @@
           <w:sz w:val="22"/>
           <w:szCs w:val="22"/>
         </w:rPr>
-        <w:t>12. (7 puntos) Compare == con is: explique con un ejemplo propio (no copiado de las diapositivas) un caso en el que a == b sea True pero a is b sea False, y otro caso en el que ambas sean True. Concluya con una regla general de cuándo usar cada una.</w:t>
+        <w:t>list</w:t>
+      </w:r>
+      <w:proofErr w:type="spellEnd"/>
+      <w:r>
+        <w:rPr>
+          <w:rFonts w:ascii="Calibri" w:eastAsia="Calibri" w:hAnsi="Calibri" w:cs="Calibri"/>
+          <w:b/>
+          <w:bCs/>
+          <w:sz w:val="22"/>
+          <w:szCs w:val="22"/>
+        </w:rPr>
+        <w:t xml:space="preserve"> y </w:t>
+      </w:r>
+      <w:proofErr w:type="spellStart"/>
+      <w:r>
+        <w:rPr>
+          <w:rFonts w:ascii="Calibri" w:eastAsia="Calibri" w:hAnsi="Calibri" w:cs="Calibri"/>
+          <w:b/>
+          <w:bCs/>
+          <w:sz w:val="22"/>
+          <w:szCs w:val="22"/>
+        </w:rPr>
+        <w:t>tuple</w:t>
+      </w:r>
+      <w:proofErr w:type="spellEnd"/>
+      <w:r>
+        <w:rPr>
+          <w:rFonts w:ascii="Calibri" w:eastAsia="Calibri" w:hAnsi="Calibri" w:cs="Calibri"/>
+          <w:b/>
+          <w:bCs/>
+          <w:sz w:val="22"/>
+          <w:szCs w:val="22"/>
+        </w:rPr>
+        <w:t xml:space="preserve"> respondiendo explícitamente: ¿en qué se diferencian en mutabilidad?, ¿cuál de las dos puede usarse como llave de un diccionario y por qué?, y dé un ejemplo de una situación (distinta a las vistas en clase) donde convenga más una tupla que una lista.</w:t>
+      </w:r>
+    </w:p>
+    <w:p>
+      <w:pPr>
+        <w:spacing w:after="120"/>
+      </w:pPr>
+      <w:r>
+        <w:rPr>
+          <w:rFonts w:ascii="Calibri" w:eastAsia="Calibri" w:hAnsi="Calibri" w:cs="Calibri"/>
+          <w:b/>
+          <w:bCs/>
+          <w:sz w:val="22"/>
+          <w:szCs w:val="22"/>
+        </w:rPr>
+        <w:t xml:space="preserve">12. (7 puntos) Compare == con </w:t>
+      </w:r>
+      <w:proofErr w:type="spellStart"/>
+      <w:r>
+        <w:rPr>
+          <w:rFonts w:ascii="Calibri" w:eastAsia="Calibri" w:hAnsi="Calibri" w:cs="Calibri"/>
+          <w:b/>
+          <w:bCs/>
+          <w:sz w:val="22"/>
+          <w:szCs w:val="22"/>
+        </w:rPr>
+        <w:t>is</w:t>
+      </w:r>
+      <w:proofErr w:type="spellEnd"/>
+      <w:r>
+        <w:rPr>
+          <w:rFonts w:ascii="Calibri" w:eastAsia="Calibri" w:hAnsi="Calibri" w:cs="Calibri"/>
+          <w:b/>
+          <w:bCs/>
+          <w:sz w:val="22"/>
+          <w:szCs w:val="22"/>
+        </w:rPr>
+        <w:t xml:space="preserve">: explique con un ejemplo propio (no copiado de las diapositivas) un caso en el que a == b sea True pero a </w:t>
+      </w:r>
+      <w:proofErr w:type="spellStart"/>
+      <w:r>
+        <w:rPr>
+          <w:rFonts w:ascii="Calibri" w:eastAsia="Calibri" w:hAnsi="Calibri" w:cs="Calibri"/>
+          <w:b/>
+          <w:bCs/>
+          <w:sz w:val="22"/>
+          <w:szCs w:val="22"/>
+        </w:rPr>
+        <w:t>is</w:t>
+      </w:r>
+      <w:proofErr w:type="spellEnd"/>
+      <w:r>
+        <w:rPr>
+          <w:rFonts w:ascii="Calibri" w:eastAsia="Calibri" w:hAnsi="Calibri" w:cs="Calibri"/>
+          <w:b/>
+          <w:bCs/>
+          <w:sz w:val="22"/>
+          <w:szCs w:val="22"/>
+        </w:rPr>
+        <w:t xml:space="preserve"> b sea False, y otro caso en el que ambas sean True. Concluya con una regla general de cuándo usar cada una.</w:t>
       </w:r>
     </w:p>
     <w:p>
@@ -4382,11 +4855,19 @@
       <w:r>
         <w:br/>
       </w:r>
+      <w:proofErr w:type="spellStart"/>
       <w:r>
         <w:rPr>
           <w:rFonts w:ascii="Consolas" w:eastAsia="Consolas" w:hAnsi="Consolas" w:cs="Consolas"/>
         </w:rPr>
-        <w:t>es_valido = n % 2 == 0 and n &gt; 0</w:t>
+        <w:t>es_valido</w:t>
+      </w:r>
+      <w:proofErr w:type="spellEnd"/>
+      <w:r>
+        <w:rPr>
+          <w:rFonts w:ascii="Consolas" w:eastAsia="Consolas" w:hAnsi="Consolas" w:cs="Consolas"/>
+        </w:rPr>
+        <w:t xml:space="preserve"> = n % 2 == 0 and n &gt; 0</w:t>
       </w:r>
       <w:r>
         <w:br/>
@@ -4403,11 +4884,19 @@
       <w:r>
         <w:br/>
       </w:r>
+      <w:proofErr w:type="spellStart"/>
       <w:r>
         <w:rPr>
           <w:rFonts w:ascii="Consolas" w:eastAsia="Consolas" w:hAnsi="Consolas" w:cs="Consolas"/>
         </w:rPr>
-        <w:t>es_valido = (n % 2 == 0) and (n &gt; 0) == True</w:t>
+        <w:t>es_valido</w:t>
+      </w:r>
+      <w:proofErr w:type="spellEnd"/>
+      <w:r>
+        <w:rPr>
+          <w:rFonts w:ascii="Consolas" w:eastAsia="Consolas" w:hAnsi="Consolas" w:cs="Consolas"/>
+        </w:rPr>
+        <w:t xml:space="preserve"> = (n % 2 == 0) and (n &gt; 0) == True</w:t>
       </w:r>
     </w:p>
     <w:p>
@@ -4465,11 +4954,33 @@
       <w:r>
         <w:br/>
       </w:r>
+      <w:proofErr w:type="spellStart"/>
       <w:r>
         <w:rPr>
           <w:rFonts w:ascii="Consolas" w:eastAsia="Consolas" w:hAnsi="Consolas" w:cs="Consolas"/>
         </w:rPr>
-        <w:t>unicas_A = list(set(notas))</w:t>
+        <w:t>unicas_A</w:t>
+      </w:r>
+      <w:proofErr w:type="spellEnd"/>
+      <w:r>
+        <w:rPr>
+          <w:rFonts w:ascii="Consolas" w:eastAsia="Consolas" w:hAnsi="Consolas" w:cs="Consolas"/>
+        </w:rPr>
+        <w:t xml:space="preserve"> = </w:t>
+      </w:r>
+      <w:proofErr w:type="spellStart"/>
+      <w:r>
+        <w:rPr>
+          <w:rFonts w:ascii="Consolas" w:eastAsia="Consolas" w:hAnsi="Consolas" w:cs="Consolas"/>
+        </w:rPr>
+        <w:t>list</w:t>
+      </w:r>
+      <w:proofErr w:type="spellEnd"/>
+      <w:r>
+        <w:rPr>
+          <w:rFonts w:ascii="Consolas" w:eastAsia="Consolas" w:hAnsi="Consolas" w:cs="Consolas"/>
+        </w:rPr>
+        <w:t>(set(notas))</w:t>
       </w:r>
       <w:r>
         <w:br/>
@@ -4486,20 +4997,36 @@
       <w:r>
         <w:br/>
       </w:r>
+      <w:proofErr w:type="spellStart"/>
       <w:r>
         <w:rPr>
           <w:rFonts w:ascii="Consolas" w:eastAsia="Consolas" w:hAnsi="Consolas" w:cs="Consolas"/>
         </w:rPr>
-        <w:t>unicas_A = []</w:t>
+        <w:t>unicas_A</w:t>
+      </w:r>
+      <w:proofErr w:type="spellEnd"/>
+      <w:r>
+        <w:rPr>
+          <w:rFonts w:ascii="Consolas" w:eastAsia="Consolas" w:hAnsi="Consolas" w:cs="Consolas"/>
+        </w:rPr>
+        <w:t xml:space="preserve"> = []</w:t>
       </w:r>
       <w:r>
         <w:br/>
       </w:r>
+      <w:proofErr w:type="spellStart"/>
       <w:r>
         <w:rPr>
           <w:rFonts w:ascii="Consolas" w:eastAsia="Consolas" w:hAnsi="Consolas" w:cs="Consolas"/>
         </w:rPr>
-        <w:t>for n in notas:</w:t>
+        <w:t>for</w:t>
+      </w:r>
+      <w:proofErr w:type="spellEnd"/>
+      <w:r>
+        <w:rPr>
+          <w:rFonts w:ascii="Consolas" w:eastAsia="Consolas" w:hAnsi="Consolas" w:cs="Consolas"/>
+        </w:rPr>
+        <w:t xml:space="preserve"> n in notas:</w:t>
       </w:r>
       <w:r>
         <w:br/>
@@ -4508,7 +5035,49 @@
         <w:rPr>
           <w:rFonts w:ascii="Consolas" w:eastAsia="Consolas" w:hAnsi="Consolas" w:cs="Consolas"/>
         </w:rPr>
-        <w:t xml:space="preserve">    if n not in unicas_A:</w:t>
+        <w:t xml:space="preserve">    </w:t>
+      </w:r>
+      <w:proofErr w:type="spellStart"/>
+      <w:r>
+        <w:rPr>
+          <w:rFonts w:ascii="Consolas" w:eastAsia="Consolas" w:hAnsi="Consolas" w:cs="Consolas"/>
+        </w:rPr>
+        <w:t>if</w:t>
+      </w:r>
+      <w:proofErr w:type="spellEnd"/>
+      <w:r>
+        <w:rPr>
+          <w:rFonts w:ascii="Consolas" w:eastAsia="Consolas" w:hAnsi="Consolas" w:cs="Consolas"/>
+        </w:rPr>
+        <w:t xml:space="preserve"> n </w:t>
+      </w:r>
+      <w:proofErr w:type="spellStart"/>
+      <w:r>
+        <w:rPr>
+          <w:rFonts w:ascii="Consolas" w:eastAsia="Consolas" w:hAnsi="Consolas" w:cs="Consolas"/>
+        </w:rPr>
+        <w:t>not</w:t>
+      </w:r>
+      <w:proofErr w:type="spellEnd"/>
+      <w:r>
+        <w:rPr>
+          <w:rFonts w:ascii="Consolas" w:eastAsia="Consolas" w:hAnsi="Consolas" w:cs="Consolas"/>
+        </w:rPr>
+        <w:t xml:space="preserve"> in </w:t>
+      </w:r>
+      <w:proofErr w:type="spellStart"/>
+      <w:r>
+        <w:rPr>
+          <w:rFonts w:ascii="Consolas" w:eastAsia="Consolas" w:hAnsi="Consolas" w:cs="Consolas"/>
+        </w:rPr>
+        <w:t>unicas_A</w:t>
+      </w:r>
+      <w:proofErr w:type="spellEnd"/>
+      <w:r>
+        <w:rPr>
+          <w:rFonts w:ascii="Consolas" w:eastAsia="Consolas" w:hAnsi="Consolas" w:cs="Consolas"/>
+        </w:rPr>
+        <w:t>:</w:t>
       </w:r>
       <w:r>
         <w:br/>
@@ -4517,7 +5086,21 @@
         <w:rPr>
           <w:rFonts w:ascii="Consolas" w:eastAsia="Consolas" w:hAnsi="Consolas" w:cs="Consolas"/>
         </w:rPr>
-        <w:t xml:space="preserve">        unicas_A.append(n)</w:t>
+        <w:t xml:space="preserve">        </w:t>
+      </w:r>
+      <w:proofErr w:type="spellStart"/>
+      <w:r>
+        <w:rPr>
+          <w:rFonts w:ascii="Consolas" w:eastAsia="Consolas" w:hAnsi="Consolas" w:cs="Consolas"/>
+        </w:rPr>
+        <w:t>unicas_A.append</w:t>
+      </w:r>
+      <w:proofErr w:type="spellEnd"/>
+      <w:r>
+        <w:rPr>
+          <w:rFonts w:ascii="Consolas" w:eastAsia="Consolas" w:hAnsi="Consolas" w:cs="Consolas"/>
+        </w:rPr>
+        <w:t>(n)</w:t>
       </w:r>
     </w:p>
     <w:p>
@@ -4553,7 +5136,15 @@
       </w:pPr>
       <w:r>
         <w:lastRenderedPageBreak/>
-        <w:t>Nivel 5 — Crear: mini-proyecto  (20 puntos)</w:t>
+        <w:t xml:space="preserve">Nivel 5 — Crear: </w:t>
+      </w:r>
+      <w:proofErr w:type="spellStart"/>
+      <w:r>
+        <w:t>mini-proyecto</w:t>
+      </w:r>
+      <w:proofErr w:type="spellEnd"/>
+      <w:r>
+        <w:t xml:space="preserve">  (20 puntos)</w:t>
       </w:r>
     </w:p>
     <w:p>
@@ -4581,7 +5172,25 @@
           <w:sz w:val="22"/>
           <w:szCs w:val="22"/>
         </w:rPr>
-        <w:t>Una veterinaria de Caucasia registra el peso (en kg) de las mascotas atendidas en el día. Algunos registros tienen errores de digitación: pesos negativos o valores None cuando la mascota se negó a subir a la báscula. Se necesita un programa que:</w:t>
+        <w:t xml:space="preserve">Una veterinaria de Caucasia registra el peso (en kg) de las mascotas atendidas en el día. Algunos registros tienen errores de digitación: pesos negativos o valores </w:t>
+      </w:r>
+      <w:proofErr w:type="spellStart"/>
+      <w:r>
+        <w:rPr>
+          <w:rFonts w:ascii="Calibri" w:eastAsia="Calibri" w:hAnsi="Calibri" w:cs="Calibri"/>
+          <w:sz w:val="22"/>
+          <w:szCs w:val="22"/>
+        </w:rPr>
+        <w:t>None</w:t>
+      </w:r>
+      <w:proofErr w:type="spellEnd"/>
+      <w:r>
+        <w:rPr>
+          <w:rFonts w:ascii="Calibri" w:eastAsia="Calibri" w:hAnsi="Calibri" w:cs="Calibri"/>
+          <w:sz w:val="22"/>
+          <w:szCs w:val="22"/>
+        </w:rPr>
+        <w:t xml:space="preserve"> cuando la mascota se negó a subir a la báscula. Se necesita un programa que:</w:t>
       </w:r>
     </w:p>
     <w:p>
@@ -4599,7 +5208,25 @@
           <w:sz w:val="22"/>
           <w:szCs w:val="22"/>
         </w:rPr>
-        <w:t>Filtre los registros válidos (positivos y no None).</w:t>
+        <w:t xml:space="preserve">Filtre los registros válidos (positivos y no </w:t>
+      </w:r>
+      <w:proofErr w:type="spellStart"/>
+      <w:r>
+        <w:rPr>
+          <w:rFonts w:ascii="Calibri" w:eastAsia="Calibri" w:hAnsi="Calibri" w:cs="Calibri"/>
+          <w:sz w:val="22"/>
+          <w:szCs w:val="22"/>
+        </w:rPr>
+        <w:t>None</w:t>
+      </w:r>
+      <w:proofErr w:type="spellEnd"/>
+      <w:r>
+        <w:rPr>
+          <w:rFonts w:ascii="Calibri" w:eastAsia="Calibri" w:hAnsi="Calibri" w:cs="Calibri"/>
+          <w:sz w:val="22"/>
+          <w:szCs w:val="22"/>
+        </w:rPr>
+        <w:t>).</w:t>
       </w:r>
     </w:p>
     <w:p>
@@ -4699,7 +5326,73 @@
           <w:sz w:val="22"/>
           <w:szCs w:val="22"/>
         </w:rPr>
-        <w:t>Criterios de evaluación: corrección funcional (10 pts), uso apropiado y variado de estructuras/operadores del curso (6 pts), claridad y comentarios (4 pts).</w:t>
+        <w:t xml:space="preserve">Criterios de evaluación: corrección funcional (10 </w:t>
+      </w:r>
+      <w:proofErr w:type="spellStart"/>
+      <w:r>
+        <w:rPr>
+          <w:rFonts w:ascii="Calibri" w:eastAsia="Calibri" w:hAnsi="Calibri" w:cs="Calibri"/>
+          <w:i/>
+          <w:iCs/>
+          <w:sz w:val="22"/>
+          <w:szCs w:val="22"/>
+        </w:rPr>
+        <w:t>pts</w:t>
+      </w:r>
+      <w:proofErr w:type="spellEnd"/>
+      <w:r>
+        <w:rPr>
+          <w:rFonts w:ascii="Calibri" w:eastAsia="Calibri" w:hAnsi="Calibri" w:cs="Calibri"/>
+          <w:i/>
+          <w:iCs/>
+          <w:sz w:val="22"/>
+          <w:szCs w:val="22"/>
+        </w:rPr>
+        <w:t xml:space="preserve">), uso apropiado y variado de estructuras/operadores del curso (6 </w:t>
+      </w:r>
+      <w:proofErr w:type="spellStart"/>
+      <w:r>
+        <w:rPr>
+          <w:rFonts w:ascii="Calibri" w:eastAsia="Calibri" w:hAnsi="Calibri" w:cs="Calibri"/>
+          <w:i/>
+          <w:iCs/>
+          <w:sz w:val="22"/>
+          <w:szCs w:val="22"/>
+        </w:rPr>
+        <w:t>pts</w:t>
+      </w:r>
+      <w:proofErr w:type="spellEnd"/>
+      <w:r>
+        <w:rPr>
+          <w:rFonts w:ascii="Calibri" w:eastAsia="Calibri" w:hAnsi="Calibri" w:cs="Calibri"/>
+          <w:i/>
+          <w:iCs/>
+          <w:sz w:val="22"/>
+          <w:szCs w:val="22"/>
+        </w:rPr>
+        <w:t xml:space="preserve">), claridad y comentarios (4 </w:t>
+      </w:r>
+      <w:proofErr w:type="spellStart"/>
+      <w:r>
+        <w:rPr>
+          <w:rFonts w:ascii="Calibri" w:eastAsia="Calibri" w:hAnsi="Calibri" w:cs="Calibri"/>
+          <w:i/>
+          <w:iCs/>
+          <w:sz w:val="22"/>
+          <w:szCs w:val="22"/>
+        </w:rPr>
+        <w:t>pts</w:t>
+      </w:r>
+      <w:proofErr w:type="spellEnd"/>
+      <w:r>
+        <w:rPr>
+          <w:rFonts w:ascii="Calibri" w:eastAsia="Calibri" w:hAnsi="Calibri" w:cs="Calibri"/>
+          <w:i/>
+          <w:iCs/>
+          <w:sz w:val="22"/>
+          <w:szCs w:val="22"/>
+        </w:rPr>
+        <w:t>).</w:t>
       </w:r>
     </w:p>
     <w:p>
@@ -4722,7 +5415,27 @@
           <w:sz w:val="22"/>
           <w:szCs w:val="22"/>
         </w:rPr>
-        <w:t>Fin del parcial. Verifique que su nombre y código estén escritos antes de entregar.</w:t>
+        <w:t xml:space="preserve">Fin del parcial. Verifique que su nombre y </w:t>
+      </w:r>
+      <w:r>
+        <w:rPr>
+          <w:rFonts w:ascii="Calibri" w:eastAsia="Calibri" w:hAnsi="Calibri" w:cs="Calibri"/>
+          <w:i/>
+          <w:iCs/>
+          <w:sz w:val="22"/>
+          <w:szCs w:val="22"/>
+        </w:rPr>
+        <w:t>documento de identidad</w:t>
+      </w:r>
+      <w:r>
+        <w:rPr>
+          <w:rFonts w:ascii="Calibri" w:eastAsia="Calibri" w:hAnsi="Calibri" w:cs="Calibri"/>
+          <w:i/>
+          <w:iCs/>
+          <w:sz w:val="22"/>
+          <w:szCs w:val="22"/>
+        </w:rPr>
+        <w:t xml:space="preserve"> estén escritos antes de entregar.</w:t>
       </w:r>
     </w:p>
     <w:sectPr>

</xml_diff>